<commit_message>
feat: add postgres healthcheck and update dependency condition in docker-compose
</commit_message>
<xml_diff>
--- a/2INT.docx
+++ b/2INT.docx
@@ -1,6 +1,6 @@
 
 <file path=word/document.xml><?xml version="1.0" encoding="utf-8"?>
-<w:document xmlns:wpc="http://schemas.microsoft.com/office/word/2010/wordprocessingCanvas" xmlns:cx="http://schemas.microsoft.com/office/drawing/2014/chartex" xmlns:cx1="http://schemas.microsoft.com/office/drawing/2015/9/8/chartex" xmlns:cx2="http://schemas.microsoft.com/office/drawing/2015/10/21/chartex" xmlns:cx3="http://schemas.microsoft.com/office/drawing/2016/5/9/chartex" xmlns:cx4="http://schemas.microsoft.com/office/drawing/2016/5/10/chartex" xmlns:cx5="http://schemas.microsoft.com/office/drawing/2016/5/11/chartex" xmlns:cx6="http://schemas.microsoft.com/office/drawing/2016/5/12/chartex" xmlns:cx7="http://schemas.microsoft.com/office/drawing/2016/5/13/chartex" xmlns:cx8="http://schemas.microsoft.com/office/drawing/2016/5/14/chartex" xmlns:mc="http://schemas.openxmlformats.org/markup-compatibility/2006" xmlns:aink="http://schemas.microsoft.com/office/drawing/2016/ink" xmlns:am3d="http://schemas.microsoft.com/office/drawing/2017/model3d" xmlns:o="urn:schemas-microsoft-com:office:office" xmlns:oel="http://schemas.microsoft.com/office/2019/extlst" xmlns:r="http://schemas.openxmlformats.org/officeDocument/2006/relationships" xmlns:m="http://schemas.openxmlformats.org/officeDocument/2006/math" xmlns:v="urn:schemas-microsoft-com:vml" xmlns:wp14="http://schemas.microsoft.com/office/word/2010/wordprocessingDrawing" xmlns:wp="http://schemas.openxmlformats.org/drawingml/2006/wordprocessingDrawing" xmlns:w10="urn:schemas-microsoft-com:office:word" xmlns:w="http://schemas.openxmlformats.org/wordprocessingml/2006/main" xmlns:w14="http://schemas.microsoft.com/office/word/2010/wordml" xmlns:w15="http://schemas.microsoft.com/office/word/2012/wordml" xmlns:w16cex="http://schemas.microsoft.com/office/word/2018/wordml/cex" xmlns:w16cid="http://schemas.microsoft.com/office/word/2016/wordml/cid" xmlns:w16="http://schemas.microsoft.com/office/word/2018/wordml" xmlns:w16du="http://schemas.microsoft.com/office/word/2023/wordml/word16du" xmlns:w16sdtdh="http://schemas.microsoft.com/office/word/2020/wordml/sdtdatahash" xmlns:w16sdtfl="http://schemas.microsoft.com/office/word/2024/wordml/sdtformatlock" xmlns:w16se="http://schemas.microsoft.com/office/word/2015/wordml/symex" xmlns:wpg="http://schemas.microsoft.com/office/word/2010/wordprocessingGroup" xmlns:wpi="http://schemas.microsoft.com/office/word/2010/wordprocessingInk" xmlns:wne="http://schemas.microsoft.com/office/word/2006/wordml" xmlns:wps="http://schemas.microsoft.com/office/word/2010/wordprocessingShape" mc:Ignorable="w14 w15 w16se w16cid w16 w16cex w16sdtdh w16sdtfl w16du wp14">
+<w:document xmlns:wpc="http://schemas.microsoft.com/office/word/2010/wordprocessingCanvas" xmlns:cx="http://schemas.microsoft.com/office/drawing/2014/chartex" xmlns:cx1="http://schemas.microsoft.com/office/drawing/2015/9/8/chartex" xmlns:cx2="http://schemas.microsoft.com/office/drawing/2015/10/21/chartex" xmlns:cx3="http://schemas.microsoft.com/office/drawing/2016/5/9/chartex" xmlns:cx4="http://schemas.microsoft.com/office/drawing/2016/5/10/chartex" xmlns:cx5="http://schemas.microsoft.com/office/drawing/2016/5/11/chartex" xmlns:cx6="http://schemas.microsoft.com/office/drawing/2016/5/12/chartex" xmlns:cx7="http://schemas.microsoft.com/office/drawing/2016/5/13/chartex" xmlns:cx8="http://schemas.microsoft.com/office/drawing/2016/5/14/chartex" xmlns:mc="http://schemas.openxmlformats.org/markup-compatibility/2006" xmlns:aink="http://schemas.microsoft.com/office/drawing/2016/ink" xmlns:am3d="http://schemas.microsoft.com/office/drawing/2017/model3d" xmlns:o="urn:schemas-microsoft-com:office:office" xmlns:oel="http://schemas.microsoft.com/office/2019/extlst" xmlns:r="http://schemas.openxmlformats.org/officeDocument/2006/relationships" xmlns:m="http://schemas.openxmlformats.org/officeDocument/2006/math" xmlns:v="urn:schemas-microsoft-com:vml" xmlns:wp14="http://schemas.microsoft.com/office/word/2010/wordprocessingDrawing" xmlns:wp="http://schemas.openxmlformats.org/drawingml/2006/wordprocessingDrawing" xmlns:w10="urn:schemas-microsoft-com:office:word" xmlns:w="http://schemas.openxmlformats.org/wordprocessingml/2006/main" xmlns:w14="http://schemas.microsoft.com/office/word/2010/wordml" xmlns:w15="http://schemas.microsoft.com/office/word/2012/wordml" xmlns:w16cei="http://schemas.microsoft.com/office/word/2026/wordml/cei" xmlns:w16cex="http://schemas.microsoft.com/office/word/2018/wordml/cex" xmlns:w16cid="http://schemas.microsoft.com/office/word/2016/wordml/cid" xmlns:w16="http://schemas.microsoft.com/office/word/2018/wordml" xmlns:w16du="http://schemas.microsoft.com/office/word/2023/wordml/word16du" xmlns:w16sdtdh="http://schemas.microsoft.com/office/word/2020/wordml/sdtdatahash" xmlns:w16sdtfl="http://schemas.microsoft.com/office/word/2024/wordml/sdtformatlock" xmlns:w16se="http://schemas.microsoft.com/office/word/2015/wordml/symex" xmlns:wpg="http://schemas.microsoft.com/office/word/2010/wordprocessingGroup" xmlns:wpi="http://schemas.microsoft.com/office/word/2010/wordprocessingInk" xmlns:wne="http://schemas.microsoft.com/office/word/2006/wordml" xmlns:wps="http://schemas.microsoft.com/office/word/2010/wordprocessingShape" mc:Ignorable="w14 w15 w16se w16cid w16 w16cex w16sdtdh w16sdtfl w16du wp14">
   <w:body>
     <w:p>
       <w:pPr>
@@ -65,18 +65,14 @@
         </w:rPr>
         <w:t xml:space="preserve">CERTIFICO, EU, Oficial de Justiça que, em cumprimento ao presente e r. mandado, </w:t>
       </w:r>
-      <w:r>
-        <w:rPr>
-          <w:szCs w:val="24"/>
-        </w:rPr>
-        <w:t>efednn na</w:t>
-      </w:r>
-      <w:r>
-        <w:rPr>
-          <w:szCs w:val="24"/>
-        </w:rPr>
-        <w:t xml:space="preserve">  r. cidade de</w:t>
-      </w:r>
+      <w:proofErr w:type="spellStart"/>
+      <w:r>
+        <w:rPr>
+          <w:szCs w:val="24"/>
+        </w:rPr>
+        <w:t>efednn</w:t>
+      </w:r>
+      <w:proofErr w:type="spellEnd"/>
       <w:r>
         <w:rPr>
           <w:szCs w:val="24"/>
@@ -87,13 +83,25 @@
         <w:rPr>
           <w:szCs w:val="24"/>
         </w:rPr>
-        <w:t>{{CIDADE}}, à</w:t>
+        <w:t>à</w:t>
       </w:r>
       <w:r>
         <w:rPr>
           <w:szCs w:val="24"/>
         </w:rPr>
         <w:t xml:space="preserve"> {{ENDERECO}}</w:t>
+      </w:r>
+      <w:r>
+        <w:rPr>
+          <w:szCs w:val="24"/>
+        </w:rPr>
+        <w:t xml:space="preserve">, </w:t>
+      </w:r>
+      <w:r>
+        <w:rPr>
+          <w:szCs w:val="24"/>
+        </w:rPr>
+        <w:t>{{CIDADE}}</w:t>
       </w:r>
       <w:r>
         <w:rPr>
@@ -187,7 +195,19 @@
         <w:rPr>
           <w:szCs w:val="24"/>
         </w:rPr>
-        <w:t>, {{CPF}}</w:t>
+        <w:t>, {{</w:t>
+      </w:r>
+      <w:r>
+        <w:rPr>
+          <w:szCs w:val="24"/>
+        </w:rPr>
+        <w:t>DOCUMENTO</w:t>
+      </w:r>
+      <w:r>
+        <w:rPr>
+          <w:szCs w:val="24"/>
+        </w:rPr>
+        <w:t>}}</w:t>
       </w:r>
       <w:r>
         <w:rPr>
@@ -231,6 +251,7 @@
         </w:rPr>
         <w:t xml:space="preserve"> </w:t>
       </w:r>
+      <w:proofErr w:type="spellStart"/>
       <w:r>
         <w:rPr>
           <w:b/>
@@ -238,6 +259,7 @@
         </w:rPr>
         <w:t>Obs</w:t>
       </w:r>
+      <w:proofErr w:type="spellEnd"/>
       <w:r>
         <w:rPr>
           <w:szCs w:val="24"/>
@@ -254,7 +276,77 @@
         <w:rPr>
           <w:szCs w:val="24"/>
         </w:rPr>
-        <w:t xml:space="preserve">com os documentos no dia/antecipação de hora designados. ddat dconst dcont dleo drb </w:t>
+        <w:t xml:space="preserve">com os documentos no dia/antecipação de hora designados. </w:t>
+      </w:r>
+      <w:proofErr w:type="spellStart"/>
+      <w:r>
+        <w:rPr>
+          <w:szCs w:val="24"/>
+        </w:rPr>
+        <w:t>ddat</w:t>
+      </w:r>
+      <w:proofErr w:type="spellEnd"/>
+      <w:r>
+        <w:rPr>
+          <w:szCs w:val="24"/>
+        </w:rPr>
+        <w:t xml:space="preserve"> </w:t>
+      </w:r>
+      <w:proofErr w:type="spellStart"/>
+      <w:r>
+        <w:rPr>
+          <w:szCs w:val="24"/>
+        </w:rPr>
+        <w:t>dconst</w:t>
+      </w:r>
+      <w:proofErr w:type="spellEnd"/>
+      <w:r>
+        <w:rPr>
+          <w:szCs w:val="24"/>
+        </w:rPr>
+        <w:t xml:space="preserve"> </w:t>
+      </w:r>
+      <w:proofErr w:type="spellStart"/>
+      <w:r>
+        <w:rPr>
+          <w:szCs w:val="24"/>
+        </w:rPr>
+        <w:t>dcont</w:t>
+      </w:r>
+      <w:proofErr w:type="spellEnd"/>
+      <w:r>
+        <w:rPr>
+          <w:szCs w:val="24"/>
+        </w:rPr>
+        <w:t xml:space="preserve"> </w:t>
+      </w:r>
+      <w:proofErr w:type="spellStart"/>
+      <w:r>
+        <w:rPr>
+          <w:szCs w:val="24"/>
+        </w:rPr>
+        <w:t>dleo</w:t>
+      </w:r>
+      <w:proofErr w:type="spellEnd"/>
+      <w:r>
+        <w:rPr>
+          <w:szCs w:val="24"/>
+        </w:rPr>
+        <w:t xml:space="preserve"> </w:t>
+      </w:r>
+      <w:proofErr w:type="spellStart"/>
+      <w:r>
+        <w:rPr>
+          <w:szCs w:val="24"/>
+        </w:rPr>
+        <w:t>drb</w:t>
+      </w:r>
+      <w:proofErr w:type="spellEnd"/>
+      <w:r>
+        <w:rPr>
+          <w:szCs w:val="24"/>
+        </w:rPr>
+        <w:t xml:space="preserve"> </w:t>
       </w:r>
     </w:p>
     <w:p>

</xml_diff>

<commit_message>
feat: implement AI-powered extraction and mandado services with repository and DTO layers
</commit_message>
<xml_diff>
--- a/2INT.docx
+++ b/2INT.docx
@@ -1,6 +1,6 @@
 
 <file path=word/document.xml><?xml version="1.0" encoding="utf-8"?>
-<w:document xmlns:wpc="http://schemas.microsoft.com/office/word/2010/wordprocessingCanvas" xmlns:cx="http://schemas.microsoft.com/office/drawing/2014/chartex" xmlns:cx1="http://schemas.microsoft.com/office/drawing/2015/9/8/chartex" xmlns:cx2="http://schemas.microsoft.com/office/drawing/2015/10/21/chartex" xmlns:cx3="http://schemas.microsoft.com/office/drawing/2016/5/9/chartex" xmlns:cx4="http://schemas.microsoft.com/office/drawing/2016/5/10/chartex" xmlns:cx5="http://schemas.microsoft.com/office/drawing/2016/5/11/chartex" xmlns:cx6="http://schemas.microsoft.com/office/drawing/2016/5/12/chartex" xmlns:cx7="http://schemas.microsoft.com/office/drawing/2016/5/13/chartex" xmlns:cx8="http://schemas.microsoft.com/office/drawing/2016/5/14/chartex" xmlns:mc="http://schemas.openxmlformats.org/markup-compatibility/2006" xmlns:aink="http://schemas.microsoft.com/office/drawing/2016/ink" xmlns:am3d="http://schemas.microsoft.com/office/drawing/2017/model3d" xmlns:o="urn:schemas-microsoft-com:office:office" xmlns:oel="http://schemas.microsoft.com/office/2019/extlst" xmlns:r="http://schemas.openxmlformats.org/officeDocument/2006/relationships" xmlns:m="http://schemas.openxmlformats.org/officeDocument/2006/math" xmlns:v="urn:schemas-microsoft-com:vml" xmlns:wp14="http://schemas.microsoft.com/office/word/2010/wordprocessingDrawing" xmlns:wp="http://schemas.openxmlformats.org/drawingml/2006/wordprocessingDrawing" xmlns:w10="urn:schemas-microsoft-com:office:word" xmlns:w="http://schemas.openxmlformats.org/wordprocessingml/2006/main" xmlns:w14="http://schemas.microsoft.com/office/word/2010/wordml" xmlns:w15="http://schemas.microsoft.com/office/word/2012/wordml" xmlns:w16cei="http://schemas.microsoft.com/office/word/2026/wordml/cei" xmlns:w16cex="http://schemas.microsoft.com/office/word/2018/wordml/cex" xmlns:w16cid="http://schemas.microsoft.com/office/word/2016/wordml/cid" xmlns:w16="http://schemas.microsoft.com/office/word/2018/wordml" xmlns:w16du="http://schemas.microsoft.com/office/word/2023/wordml/word16du" xmlns:w16sdtdh="http://schemas.microsoft.com/office/word/2020/wordml/sdtdatahash" xmlns:w16sdtfl="http://schemas.microsoft.com/office/word/2024/wordml/sdtformatlock" xmlns:w16se="http://schemas.microsoft.com/office/word/2015/wordml/symex" xmlns:wpg="http://schemas.microsoft.com/office/word/2010/wordprocessingGroup" xmlns:wpi="http://schemas.microsoft.com/office/word/2010/wordprocessingInk" xmlns:wne="http://schemas.microsoft.com/office/word/2006/wordml" xmlns:wps="http://schemas.microsoft.com/office/word/2010/wordprocessingShape" mc:Ignorable="w14 w15 w16se w16cid w16 w16cex w16sdtdh w16sdtfl w16du wp14">
+<w:document xmlns:wpc="http://schemas.microsoft.com/office/word/2010/wordprocessingCanvas" xmlns:cx="http://schemas.microsoft.com/office/drawing/2014/chartex" xmlns:cx1="http://schemas.microsoft.com/office/drawing/2015/9/8/chartex" xmlns:cx2="http://schemas.microsoft.com/office/drawing/2015/10/21/chartex" xmlns:cx3="http://schemas.microsoft.com/office/drawing/2016/5/9/chartex" xmlns:cx4="http://schemas.microsoft.com/office/drawing/2016/5/10/chartex" xmlns:cx5="http://schemas.microsoft.com/office/drawing/2016/5/11/chartex" xmlns:cx6="http://schemas.microsoft.com/office/drawing/2016/5/12/chartex" xmlns:cx7="http://schemas.microsoft.com/office/drawing/2016/5/13/chartex" xmlns:cx8="http://schemas.microsoft.com/office/drawing/2016/5/14/chartex" xmlns:mc="http://schemas.openxmlformats.org/markup-compatibility/2006" xmlns:aink="http://schemas.microsoft.com/office/drawing/2016/ink" xmlns:am3d="http://schemas.microsoft.com/office/drawing/2017/model3d" xmlns:o="urn:schemas-microsoft-com:office:office" xmlns:oel="http://schemas.microsoft.com/office/2019/extlst" xmlns:r="http://schemas.openxmlformats.org/officeDocument/2006/relationships" xmlns:m="http://schemas.openxmlformats.org/officeDocument/2006/math" xmlns:v="urn:schemas-microsoft-com:vml" xmlns:wp14="http://schemas.microsoft.com/office/word/2010/wordprocessingDrawing" xmlns:wp="http://schemas.openxmlformats.org/drawingml/2006/wordprocessingDrawing" xmlns:w10="urn:schemas-microsoft-com:office:word" xmlns:w="http://schemas.openxmlformats.org/wordprocessingml/2006/main" xmlns:w14="http://schemas.microsoft.com/office/word/2010/wordml" xmlns:w15="http://schemas.microsoft.com/office/word/2012/wordml" xmlns:w16cex="http://schemas.microsoft.com/office/word/2018/wordml/cex" xmlns:w16cid="http://schemas.microsoft.com/office/word/2016/wordml/cid" xmlns:w16="http://schemas.microsoft.com/office/word/2018/wordml" xmlns:w16du="http://schemas.microsoft.com/office/word/2023/wordml/word16du" xmlns:w16sdtdh="http://schemas.microsoft.com/office/word/2020/wordml/sdtdatahash" xmlns:w16sdtfl="http://schemas.microsoft.com/office/word/2024/wordml/sdtformatlock" xmlns:w16se="http://schemas.microsoft.com/office/word/2015/wordml/symex" xmlns:wpg="http://schemas.microsoft.com/office/word/2010/wordprocessingGroup" xmlns:wpi="http://schemas.microsoft.com/office/word/2010/wordprocessingInk" xmlns:wne="http://schemas.microsoft.com/office/word/2006/wordml" xmlns:wps="http://schemas.microsoft.com/office/word/2010/wordprocessingShape" mc:Ignorable="w14 w15 w16se w16cid w16 w16cex w16sdtdh w16sdtfl w16du wp14">
   <w:body>
     <w:p>
       <w:pPr>
@@ -65,19 +65,11 @@
         </w:rPr>
         <w:t xml:space="preserve">CERTIFICO, EU, Oficial de Justiça que, em cumprimento ao presente e r. mandado, </w:t>
       </w:r>
-      <w:proofErr w:type="spellStart"/>
-      <w:r>
-        <w:rPr>
-          <w:szCs w:val="24"/>
-        </w:rPr>
-        <w:t>efednn</w:t>
-      </w:r>
-      <w:proofErr w:type="spellEnd"/>
-      <w:r>
-        <w:rPr>
-          <w:szCs w:val="24"/>
-        </w:rPr>
-        <w:t xml:space="preserve"> </w:t>
+      <w:r>
+        <w:rPr>
+          <w:szCs w:val="24"/>
+        </w:rPr>
+        <w:t xml:space="preserve">efednn </w:t>
       </w:r>
       <w:r>
         <w:rPr>
@@ -95,13 +87,7 @@
         <w:rPr>
           <w:szCs w:val="24"/>
         </w:rPr>
-        <w:t xml:space="preserve">, </w:t>
-      </w:r>
-      <w:r>
-        <w:rPr>
-          <w:szCs w:val="24"/>
-        </w:rPr>
-        <w:t>{{CIDADE}}</w:t>
+        <w:t>, {{CIDADE}}</w:t>
       </w:r>
       <w:r>
         <w:rPr>
@@ -195,19 +181,13 @@
         <w:rPr>
           <w:szCs w:val="24"/>
         </w:rPr>
-        <w:t>, {{</w:t>
-      </w:r>
-      <w:r>
-        <w:rPr>
-          <w:szCs w:val="24"/>
-        </w:rPr>
-        <w:t>DOCUMENTO</w:t>
-      </w:r>
-      <w:r>
-        <w:rPr>
-          <w:szCs w:val="24"/>
-        </w:rPr>
-        <w:t>}}</w:t>
+        <w:t xml:space="preserve"> </w:t>
+      </w:r>
+      <w:r>
+        <w:rPr>
+          <w:szCs w:val="24"/>
+        </w:rPr>
+        <w:t>{{DOCUMENTO}}</w:t>
       </w:r>
       <w:r>
         <w:rPr>
@@ -251,7 +231,6 @@
         </w:rPr>
         <w:t xml:space="preserve"> </w:t>
       </w:r>
-      <w:proofErr w:type="spellStart"/>
       <w:r>
         <w:rPr>
           <w:b/>
@@ -259,7 +238,6 @@
         </w:rPr>
         <w:t>Obs</w:t>
       </w:r>
-      <w:proofErr w:type="spellEnd"/>
       <w:r>
         <w:rPr>
           <w:szCs w:val="24"/>
@@ -276,77 +254,7 @@
         <w:rPr>
           <w:szCs w:val="24"/>
         </w:rPr>
-        <w:t xml:space="preserve">com os documentos no dia/antecipação de hora designados. </w:t>
-      </w:r>
-      <w:proofErr w:type="spellStart"/>
-      <w:r>
-        <w:rPr>
-          <w:szCs w:val="24"/>
-        </w:rPr>
-        <w:t>ddat</w:t>
-      </w:r>
-      <w:proofErr w:type="spellEnd"/>
-      <w:r>
-        <w:rPr>
-          <w:szCs w:val="24"/>
-        </w:rPr>
-        <w:t xml:space="preserve"> </w:t>
-      </w:r>
-      <w:proofErr w:type="spellStart"/>
-      <w:r>
-        <w:rPr>
-          <w:szCs w:val="24"/>
-        </w:rPr>
-        <w:t>dconst</w:t>
-      </w:r>
-      <w:proofErr w:type="spellEnd"/>
-      <w:r>
-        <w:rPr>
-          <w:szCs w:val="24"/>
-        </w:rPr>
-        <w:t xml:space="preserve"> </w:t>
-      </w:r>
-      <w:proofErr w:type="spellStart"/>
-      <w:r>
-        <w:rPr>
-          <w:szCs w:val="24"/>
-        </w:rPr>
-        <w:t>dcont</w:t>
-      </w:r>
-      <w:proofErr w:type="spellEnd"/>
-      <w:r>
-        <w:rPr>
-          <w:szCs w:val="24"/>
-        </w:rPr>
-        <w:t xml:space="preserve"> </w:t>
-      </w:r>
-      <w:proofErr w:type="spellStart"/>
-      <w:r>
-        <w:rPr>
-          <w:szCs w:val="24"/>
-        </w:rPr>
-        <w:t>dleo</w:t>
-      </w:r>
-      <w:proofErr w:type="spellEnd"/>
-      <w:r>
-        <w:rPr>
-          <w:szCs w:val="24"/>
-        </w:rPr>
-        <w:t xml:space="preserve"> </w:t>
-      </w:r>
-      <w:proofErr w:type="spellStart"/>
-      <w:r>
-        <w:rPr>
-          <w:szCs w:val="24"/>
-        </w:rPr>
-        <w:t>drb</w:t>
-      </w:r>
-      <w:proofErr w:type="spellEnd"/>
-      <w:r>
-        <w:rPr>
-          <w:szCs w:val="24"/>
-        </w:rPr>
-        <w:t xml:space="preserve"> </w:t>
+        <w:t xml:space="preserve">com os documentos no dia/antecipação de hora designados. ddat dconst dcont dleo drb </w:t>
       </w:r>
     </w:p>
     <w:p>

</xml_diff>